<commit_message>
Deploy preview for PR 70 🛫
</commit_message>
<xml_diff>
--- a/pr-preview/pr-70/vignettes/articles/quarto_article.docx
+++ b/pr-preview/pr-70/vignettes/articles/quarto_article.docx
@@ -3301,89 +3301,13 @@
       </w:r>
     </w:p>
     <w:bookmarkEnd w:id="48"/>
-    <w:bookmarkStart w:id="52" w:name="diagrams-with-mermaid"/>
+    <w:bookmarkStart w:id="49" w:name="mathematical-notation"/>
     <w:p>
       <w:pPr>
         <w:pStyle w:val="Heading2"/>
       </w:pPr>
       <w:r>
-        <w:t xml:space="preserve">6 Diagrams with Mermaid</w:t>
-      </w:r>
-    </w:p>
-    <w:p>
-      <w:pPr>
-        <w:pStyle w:val="FirstParagraph"/>
-      </w:pPr>
-    </w:p>
-    <w:p>
-      <w:pPr>
-        <w:pStyle w:val="BodyText"/>
-      </w:pPr>
-      <w:r>
-        <w:drawing>
-          <wp:inline>
-            <wp:extent cx="5334000" cy="427892"/>
-            <wp:effectExtent b="0" l="0" r="0" t="0"/>
-            <wp:docPr descr="" title="" id="50" name="Picture"/>
-            <a:graphic>
-              <a:graphicData uri="http://schemas.openxmlformats.org/drawingml/2006/picture">
-                <pic:pic>
-                  <pic:nvPicPr>
-                    <pic:cNvPr descr="quarto_article_files/figure-docx/mermaid-figure-1.png" id="51" name="Picture"/>
-                    <pic:cNvPicPr>
-                      <a:picLocks noChangeArrowheads="1" noChangeAspect="1"/>
-                    </pic:cNvPicPr>
-                  </pic:nvPicPr>
-                  <pic:blipFill>
-                    <a:blip r:embed="rId49"/>
-                    <a:stretch>
-                      <a:fillRect/>
-                    </a:stretch>
-                  </pic:blipFill>
-                  <pic:spPr bwMode="auto">
-                    <a:xfrm>
-                      <a:off x="0" y="0"/>
-                      <a:ext cx="5334000" cy="427892"/>
-                    </a:xfrm>
-                    <a:prstGeom prst="rect">
-                      <a:avLst/>
-                    </a:prstGeom>
-                    <a:noFill/>
-                    <a:ln w="9525">
-                      <a:noFill/>
-                      <a:headEnd/>
-                      <a:tailEnd/>
-                    </a:ln>
-                  </pic:spPr>
-                </pic:pic>
-              </a:graphicData>
-            </a:graphic>
-          </wp:inline>
-        </w:drawing>
-      </w:r>
-    </w:p>
-    <w:p>
-      <w:pPr>
-        <w:pStyle w:val="BodyText"/>
-      </w:pPr>
-      <w:r>
-        <w:t xml:space="preserve"> </w:t>
-      </w:r>
-      <w:r>
-        <w:t xml:space="preserve">Package workflow diagram</w:t>
-      </w:r>
-      <w:r>
-        <w:t xml:space="preserve"> </w:t>
-      </w:r>
-    </w:p>
-    <w:bookmarkEnd w:id="52"/>
-    <w:bookmarkStart w:id="53" w:name="mathematical-notation"/>
-    <w:p>
-      <w:pPr>
-        <w:pStyle w:val="Heading2"/>
-      </w:pPr>
-      <w:r>
-        <w:t xml:space="preserve">7 Mathematical Notation</w:t>
+        <w:t xml:space="preserve">6 Mathematical Notation</w:t>
       </w:r>
     </w:p>
     <w:p>
@@ -3584,14 +3508,14 @@
         </m:oMath>
       </m:oMathPara>
     </w:p>
-    <w:bookmarkEnd w:id="53"/>
-    <w:bookmarkStart w:id="57" w:name="tips-and-best-practices"/>
+    <w:bookmarkEnd w:id="49"/>
+    <w:bookmarkStart w:id="53" w:name="tips-and-best-practices"/>
     <w:p>
       <w:pPr>
         <w:pStyle w:val="Heading2"/>
       </w:pPr>
       <w:r>
-        <w:t xml:space="preserve">8 Tips and Best Practices</w:t>
+        <w:t xml:space="preserve">7 Tips and Best Practices</w:t>
       </w:r>
     </w:p>
     <w:tbl>
@@ -3635,18 +3559,18 @@
                 <wp:inline>
                   <wp:extent cx="152400" cy="152400"/>
                   <wp:effectExtent b="0" l="0" r="0" t="0"/>
-                  <wp:docPr descr="" title="" id="55" name="Picture"/>
+                  <wp:docPr descr="" title="" id="51" name="Picture"/>
                   <a:graphic>
                     <a:graphicData uri="http://schemas.openxmlformats.org/drawingml/2006/picture">
                       <pic:pic>
                         <pic:nvPicPr>
-                          <pic:cNvPr descr="/opt/quarto/share/formats/docx/tip.png" id="56" name="Picture"/>
+                          <pic:cNvPr descr="/opt/quarto/share/formats/docx/tip.png" id="52" name="Picture"/>
                           <pic:cNvPicPr>
                             <a:picLocks noChangeArrowheads="1" noChangeAspect="1"/>
                           </pic:cNvPicPr>
                         </pic:nvPicPr>
                         <pic:blipFill>
-                          <a:blip r:embed="rId54"/>
+                          <a:blip r:embed="rId50"/>
                           <a:stretch>
                             <a:fillRect/>
                           </a:stretch>
@@ -3770,14 +3694,14 @@
         </w:tc>
       </w:tr>
     </w:tbl>
-    <w:bookmarkEnd w:id="57"/>
-    <w:bookmarkStart w:id="58" w:name="conclusion"/>
+    <w:bookmarkEnd w:id="53"/>
+    <w:bookmarkStart w:id="54" w:name="conclusion"/>
     <w:p>
       <w:pPr>
         <w:pStyle w:val="Heading2"/>
       </w:pPr>
       <w:r>
-        <w:t xml:space="preserve">9 Conclusion</w:t>
+        <w:t xml:space="preserve">8 Conclusion</w:t>
       </w:r>
     </w:p>
     <w:p>
@@ -3788,14 +3712,14 @@
         <w:t xml:space="preserve">This article demonstrates the advanced capabilities of Quarto for creating rich, interactive documentation for R packages. The integration with pkgdown makes it easy to create professional package websites.</w:t>
       </w:r>
     </w:p>
-    <w:bookmarkEnd w:id="58"/>
-    <w:bookmarkStart w:id="62" w:name="learn-more"/>
+    <w:bookmarkEnd w:id="54"/>
+    <w:bookmarkStart w:id="58" w:name="learn-more"/>
     <w:p>
       <w:pPr>
         <w:pStyle w:val="Heading2"/>
       </w:pPr>
       <w:r>
-        <w:t xml:space="preserve">10 Learn More</w:t>
+        <w:t xml:space="preserve">9 Learn More</w:t>
       </w:r>
     </w:p>
     <w:p>
@@ -3812,7 +3736,7 @@
       <w:r>
         <w:t xml:space="preserve"> </w:t>
       </w:r>
-      <w:hyperlink r:id="rId59">
+      <w:hyperlink r:id="rId55">
         <w:r>
           <w:rPr>
             <w:rStyle w:val="Hyperlink"/>
@@ -3835,7 +3759,7 @@
       <w:r>
         <w:t xml:space="preserve"> </w:t>
       </w:r>
-      <w:hyperlink r:id="rId60">
+      <w:hyperlink r:id="rId56">
         <w:r>
           <w:rPr>
             <w:rStyle w:val="Hyperlink"/>
@@ -3858,7 +3782,7 @@
       <w:r>
         <w:t xml:space="preserve"> </w:t>
       </w:r>
-      <w:hyperlink r:id="rId61">
+      <w:hyperlink r:id="rId57">
         <w:r>
           <w:rPr>
             <w:rStyle w:val="Hyperlink"/>
@@ -3867,19 +3791,19 @@
         </w:r>
       </w:hyperlink>
     </w:p>
-    <w:bookmarkEnd w:id="62"/>
-    <w:bookmarkStart w:id="64" w:name="references"/>
+    <w:bookmarkEnd w:id="58"/>
+    <w:bookmarkStart w:id="60" w:name="references"/>
     <w:p>
       <w:pPr>
         <w:pStyle w:val="Heading2"/>
       </w:pPr>
       <w:r>
-        <w:t xml:space="preserve">11 References</w:t>
-      </w:r>
-    </w:p>
-    <w:bookmarkStart w:id="63" w:name="refs"/>
-    <w:bookmarkEnd w:id="63"/>
-    <w:bookmarkEnd w:id="64"/>
+        <w:t xml:space="preserve">10 References</w:t>
+      </w:r>
+    </w:p>
+    <w:bookmarkStart w:id="59" w:name="refs"/>
+    <w:bookmarkEnd w:id="59"/>
+    <w:bookmarkEnd w:id="60"/>
     <w:sectPr>
       <w:footnotePr>
         <w:numRestart w:val="eachSect"/>

</xml_diff>